<commit_message>
Fix Jay Kay bulk payslip download: native browser streaming ZIP, pre-cached logos, and disk-buffered PDF generation
</commit_message>
<xml_diff>
--- a/HRS_Accomplishments_Summary_Oct2026.docx
+++ b/HRS_Accomplishments_Summary_Oct2026.docx
@@ -506,6 +506,84 @@
       <w:textDirection w:val="lrTb"/>
       <w:docGrid w:type="default" w:linePitch="100" w:charSpace="4294963199"/>
     </w:sectPr>
+    <!-- Section 23 -->
+    <w:p xmlns:w="http://schemas.openxmlformats.org/wordprocessingml/2006/main">
+      <w:r>
+        <w:rPr>
+          <w:b/>
+          <w:sz w:val="32"/>
+          <w:color w:val="1F497D"/>
+        </w:rPr>
+        <w:t>23. Melcom Contracts Bulk Upload Resiliency &amp; Automatic Fallbacks (Oct 2026)</w:t>
+      </w:r>
+    </w:p>
+    <w:p xmlns:w="http://schemas.openxmlformats.org/wordprocessingml/2006/main">
+      <w:r>
+        <w:rPr>
+          <w:b/>
+        </w:rPr>
+        <w:t>• Root Cause Elimination for HR Email: </w:t>
+      </w:r>
+      <w:r>
+        <w:t>Resolved the upload blocker where Melcom contract Excel files without an explicit HR Email column or with empty cells failed validation with 'The hremail field is required.' on every row. Implemented automatic fallback to auth()-&gt;user()?-&gt;email or hr@sbpafrica.com.</w:t>
+      </w:r>
+    </w:p>
+    <w:p xmlns:w="http://schemas.openxmlformats.org/wordprocessingml/2006/main">
+      <w:r>
+        <w:rPr>
+          <w:b/>
+        </w:rPr>
+        <w:t>• Header-Driven Dynamic Column Mapping: </w:t>
+      </w:r>
+      <w:r>
+        <w:t>Replaced rigid hardcoded column indexes (['A'] to ['M']) with a dynamic alias scanner that automatically detects header rows and matches column names regardless of column ordering or missing optional columns.</w:t>
+      </w:r>
+    </w:p>
+    <w:p xmlns:w="http://schemas.openxmlformats.org/wordprocessingml/2006/main">
+      <w:r>
+        <w:rPr>
+          <w:b/>
+        </w:rPr>
+        <w:t>• Robust Date Parsing: </w:t>
+      </w:r>
+      <w:r>
+        <w:t>Implemented parseDateValue() to seamlessly convert Excel numeric serial timestamps (e.g. 45892) and diverse string formats (Y-m-d, d/m/Y, m/d/Y, d-m-Y, d M Y) without throwing uncaught exceptions.</w:t>
+      </w:r>
+    </w:p>
+    <w:p xmlns:w="http://schemas.openxmlformats.org/wordprocessingml/2006/main">
+      <w:r>
+        <w:rPr>
+          <w:b/>
+        </w:rPr>
+        <w:t>• Upsert &amp; Signature Preservation: </w:t>
+      </w:r>
+      <w:r>
+        <w:t>Switched from Contract::create() with duplicate-id rejection to Contract::updateOrCreate(), enabling seamless contract updates and renewals while preserving employee signatures and activation flags.</w:t>
+      </w:r>
+    </w:p>
+    <w:p xmlns:w="http://schemas.openxmlformats.org/wordprocessingml/2006/main">
+      <w:r>
+        <w:rPr>
+          <w:b/>
+        </w:rPr>
+        <w:t>• PDF Download Issue Date Correction: </w:t>
+      </w:r>
+      <w:r>
+        <w:t>Fixed bug in download() where issuedate erroneously referenced -&gt;id instead of -&gt;issuedate.</w:t>
+      </w:r>
+    </w:p>
+    <w:p xmlns:w="http://schemas.openxmlformats.org/wordprocessingml/2006/main">
+      <w:r>
+        <w:rPr>
+          <w:b/>
+        </w:rPr>
+        <w:t>• Production Build &amp; Strict Exclusions: </w:t>
+      </w:r>
+      <w:r>
+        <w:t>Rebuilt frontend assets via Vite and generated hrs-deploy.zip ensuring all .env* files and root .htaccess are strictly excluded from the deployment archive.</w:t>
+      </w:r>
+    </w:p>
+    <w:p xmlns:w="http://schemas.openxmlformats.org/wordprocessingml/2006/main"/>
   </w:body>
 </w:document>
 </file>

</xml_diff>